<commit_message>
Apply user edits to Ch8 FA (typo + pacing commas + phrasing)
Round-trip edits accepted:

1. Fix typo 'ساراs' → 'سارا' — accidental Latin 's' from a shift-slip
   in an earlier draft; English source was already correct.
2. Opening tense: 'ماشین رو fix کرد' → 'fix می کنه' — present continuous
   fits the ongoing state better than past.
3. Softer word choice: 'اون انسان اون طرف صفحه' → 'اون آدمیه که طرف
   دیگه صفحه' — reads less clinical, closer to spoken voice.
4. Four pacing commas added: after 'تنها،', 'یه جواب،', 'دیدی‌شون،',
   and doubled ('ماشین،' + 'انسان،') in the closing summary — the
   rhythm the user is landing on for this book's voice.
5. Emphasis pattern: '*هدایت* کردی' → '«هدایت کردی»' — guillemets on the
   two-word phrase rather than italics on one word.

Rebuilt .docx via build-fa-docx.py — RTL/bidi markers intact.

Co-Authored-By: Claude Opus 4.7 <noreply@anthropic.com>
Claude-Session: https://claude.ai/code/session_013uHhYLNWuZQq9CzW5dkG9w
</commit_message>
<xml_diff>
--- a/bestapply/products/immigrant-job-search-system/chapters/08-twenty-cover-letters.fa.docx
+++ b/bestapply/products/immigrant-job-search-system/chapters/08-twenty-cover-letters.fa.docx
@@ -25,19 +25,19 @@
         <w:rPr>
           <w:rtl/>
         </w:rPr>
-        <w:t xml:space="preserve">Part 2 ماشین رو fix کرد. هر فیلتری که قبلاً ساراs رو قبل از این‌که یه انسان فایلش رو ببینه رد می‌کرد — کد NOC، چک‌باکس مجوز کار، نامرئی بودن توی LinkedIn، resume ای که با ATS دشمنه — الان برای تو تنظیم شده.</w:t>
-      </w:r>
-    </w:p>
-    <w:p>
-      <w:pPr>
-        <w:bidi/>
-        <w:jc w:val="right"/>
-      </w:pPr>
-      <w:r>
-        <w:rPr>
-          <w:rtl/>
-        </w:rPr>
-        <w:t xml:space="preserve">Part 3 دربارهٔ اون انسان اون طرف صفحه‌ست.</w:t>
+        <w:t xml:space="preserve">Part 2 ماشین رو fix می کنه. هر فیلتری که قبلاً سارا رو قبل از این‌که یه انسان فایلش رو ببینه رد می‌کرد — کد NOC، چک‌باکس مجوز کار، نامرئی بودن توی LinkedIn، resume ای که با ATS دشمنه — الان برای تو تنظیم شده.</w:t>
+      </w:r>
+    </w:p>
+    <w:p>
+      <w:pPr>
+        <w:bidi/>
+        <w:jc w:val="right"/>
+      </w:pPr>
+      <w:r>
+        <w:rPr>
+          <w:rtl/>
+        </w:rPr>
+        <w:t xml:space="preserve">Part 3 دربارهٔ اون آدمیه که طرف دیگه صفحه‌ست.</w:t>
       </w:r>
     </w:p>
     <w:p>
@@ -169,7 +169,7 @@
         <w:rPr>
           <w:rtl/>
         </w:rPr>
-        <w:t xml:space="preserve">این فصل بزرگ‌ترین single-chapter این کتابه چون تنها کاری رو می‌کنه که بعد از پاس ATS بالاترین leverage</w:t>
+        <w:t xml:space="preserve">این فصل بزرگ‌ترین single-chapter این کتابه چون تنها، کاری رو می‌کنه که بعد از پاس ATS بالاترین leverage</w:t>
       </w:r>
       <w:r>
         <w:rPr>
@@ -188,45 +188,19 @@
         <w:rPr>
           <w:rtl/>
         </w:rPr>
-        <w:t xml:space="preserve">رو داره: بهت یاد می‌ده cover letter ای با AI بنویسی که recruiter تا آخرش می‌خونه. نه به این خاطر که AI رو مخفی کردی. به این خاطر که AI رو</w:t>
-      </w:r>
-      <w:r>
-        <w:rPr>
-          <w:rtl/>
-        </w:rPr>
-        <w:t xml:space="preserve"> </w:t>
-      </w:r>
-      <w:r>
-        <w:rPr>
-          <w:rtl/>
-          <w:iCs/>
-          <w:i/>
-        </w:rPr>
-        <w:t xml:space="preserve">هدایت</w:t>
-      </w:r>
-      <w:r>
-        <w:rPr>
-          <w:rtl/>
-        </w:rPr>
-        <w:t xml:space="preserve"> </w:t>
-      </w:r>
-      <w:r>
-        <w:rPr>
-          <w:rtl/>
-        </w:rPr>
-        <w:t xml:space="preserve">کردی.</w:t>
-      </w:r>
-    </w:p>
-    <w:p>
-      <w:pPr>
-        <w:bidi/>
-        <w:jc w:val="right"/>
-      </w:pPr>
-      <w:r>
-        <w:rPr>
-          <w:rtl/>
-        </w:rPr>
-        <w:t xml:space="preserve">هر application ردشده‌ای که یه مهاجر باهاش مواجه می‌شه، غیر از زمان، انگیزهٔ ادامه دادن رو هم ازش می‌گیره. cover letter جاییه که این انگیزه رو دوباره می‌خری — یه جواب کل هفته رو عوض می‌کنه.</w:t>
+        <w:t xml:space="preserve">رو داره: بهت یاد می‌ده cover letter ای با AI بنویسی که recruiter تا آخرش می‌خونه. نه به این خاطر که AI رو مخفی کردی. به این خاطر که AI رو «هدایت کردی».</w:t>
+      </w:r>
+    </w:p>
+    <w:p>
+      <w:pPr>
+        <w:bidi/>
+        <w:jc w:val="right"/>
+      </w:pPr>
+      <w:r>
+        <w:rPr>
+          <w:rtl/>
+        </w:rPr>
+        <w:t xml:space="preserve">هر application ردشده‌ای که یه مهاجر باهاش مواجه می‌شه، غیر از زمان، انگیزهٔ ادامه دادن رو هم ازش می‌گیره. cover letter جاییه که این انگیزه رو دوباره می‌خری — یه جواب، کل هفته رو عوض می‌کنه.</w:t>
       </w:r>
     </w:p>
     <w:p>
@@ -309,7 +283,7 @@
         <w:rPr>
           <w:rtl/>
         </w:rPr>
-        <w:t xml:space="preserve">رد نمی‌کنن. لازم نیست. سه الگوی مشخص مثل تابلوی نئون روشن می‌شن، و وقتی دیدی‌شون دیگه نمی‌تونی نبینی.</w:t>
+        <w:t xml:space="preserve">رد نمی‌کنن. لازم نیست. سه الگوی مشخص مثل تابلوی نئون روشن می‌شن، و وقتی دیدی‌شون، دیگه نمی‌تونی نبینی.</w:t>
       </w:r>
     </w:p>
     <w:p>
@@ -4301,7 +4275,7 @@
         <w:rPr>
           <w:rtl/>
         </w:rPr>
-        <w:t xml:space="preserve">Part 2 تو رو برای ماشین قابل دیدن کرد. این فصل تو رو برای انسان قابل خوندن کرد. فصل ۹ مهمات لازم برای شلیک هر دو تا رو برای صد application بعدیت می‌ده.</w:t>
+        <w:t xml:space="preserve">Part 2 تو رو برای ماشین، قابل دیدن کرد. این فصل تو رو برای انسان، قابل خوندن کرد. فصل ۹ مهمات لازم برای شلیک هر دو تا رو برای صد application بعدیت می‌ده.</w:t>
       </w:r>
     </w:p>
     <w:bookmarkEnd w:id="39"/>

</xml_diff>